<commit_message>
Release 37: second tenant formatted like the first in the Cyprus lease templates
Co-Authored-By: Claude Opus 5 <noreply@anthropic.com>
</commit_message>
<xml_diff>
--- a/pages/templates/lease_templates/cyprus_english_lease_template.docx
+++ b/pages/templates/lease_templates/cyprus_english_lease_template.docx
@@ -1993,14 +1993,25 @@
           <w:rFonts w:ascii="Trebuchet MS" w:hAnsi="Trebuchet MS"/>
           <w:b/>
           <w:bCs/>
+          <w:i w:val="0"/>
+          <w:color w:val="000000"/>
+          <w:sz w:val="20"/>
+          <w:szCs w:val="20"/>
+        </w:rPr>
+        <w:t>{{ second_tenant_name }}</w:t>
+      </w:r>
+      <w:r>
+        <w:rPr>
+          <w:rFonts w:ascii="Trebuchet MS" w:hAnsi="Trebuchet MS"/>
+          <w:b w:val="0"/>
+          <w:bCs/>
           <w:i/>
           <w:color w:val="000000"/>
           <w:sz w:val="20"/>
           <w:szCs w:val="20"/>
         </w:rPr>
-        <w:t xml:space="preserve">{{ </w:t>
-      </w:r>
-      <w:proofErr w:type="spellStart"/>
+        <w:t xml:space="preserve"> (</w:t>
+      </w:r>
       <w:r>
         <w:rPr>
           <w:rFonts w:ascii="Trebuchet MS" w:hAnsi="Trebuchet MS"/>
@@ -2011,216 +2022,37 @@
           <w:sz w:val="20"/>
           <w:szCs w:val="20"/>
         </w:rPr>
-        <w:t>second</w:t>
-      </w:r>
-      <w:proofErr w:type="gramEnd"/>
-      <w:r>
-        <w:rPr>
-          <w:rFonts w:ascii="Trebuchet MS" w:hAnsi="Trebuchet MS"/>
-          <w:b/>
+        <w:t>Passport/ID No.:</w:t>
+      </w:r>
+      <w:r>
+        <w:rPr>
+          <w:rFonts w:ascii="Trebuchet MS" w:hAnsi="Trebuchet MS"/>
+          <w:b w:val="0"/>
           <w:bCs/>
           <w:i/>
           <w:color w:val="000000"/>
           <w:sz w:val="20"/>
           <w:szCs w:val="20"/>
         </w:rPr>
-        <w:t>_tenant_</w:t>
-      </w:r>
-      <w:proofErr w:type="gramStart"/>
-      <w:r>
-        <w:rPr>
-          <w:rFonts w:ascii="Trebuchet MS" w:hAnsi="Trebuchet MS"/>
-          <w:b/>
-          <w:bCs/>
-          <w:i/>
-          <w:color w:val="000000"/>
-          <w:sz w:val="20"/>
-          <w:szCs w:val="20"/>
-        </w:rPr>
-        <w:t>name</w:t>
-      </w:r>
+        <w:t xml:space="preserve"> {{ second_tenant_passport_id }} issued in {{ second_tenant_passport_country }})</w:t>
+      </w:r>
+      <w:proofErr w:type="spellStart"/>
+      <w:proofErr w:type="gramEnd"/>
+      <w:proofErr w:type="gramStart"/>
       <w:proofErr w:type="spellEnd"/>
-      <w:r>
-        <w:rPr>
-          <w:rFonts w:ascii="Trebuchet MS" w:hAnsi="Trebuchet MS"/>
-          <w:b/>
-          <w:bCs/>
-          <w:i/>
-          <w:color w:val="000000"/>
-          <w:sz w:val="20"/>
-          <w:szCs w:val="20"/>
-        </w:rPr>
-        <w:t xml:space="preserve"> }</w:t>
-      </w:r>
-      <w:proofErr w:type="gramEnd"/>
-      <w:r>
-        <w:rPr>
-          <w:rFonts w:ascii="Trebuchet MS" w:hAnsi="Trebuchet MS"/>
-          <w:b/>
-          <w:bCs/>
-          <w:i/>
-          <w:color w:val="000000"/>
-          <w:sz w:val="20"/>
-          <w:szCs w:val="20"/>
-        </w:rPr>
-        <w:t xml:space="preserve">} (Passport/ID No.: </w:t>
-      </w:r>
-      <w:proofErr w:type="gramStart"/>
-      <w:r>
-        <w:rPr>
-          <w:rFonts w:ascii="Trebuchet MS" w:hAnsi="Trebuchet MS"/>
-          <w:b/>
-          <w:bCs/>
-          <w:i/>
-          <w:color w:val="000000"/>
-          <w:sz w:val="20"/>
-          <w:szCs w:val="20"/>
-        </w:rPr>
-        <w:t xml:space="preserve">{{ </w:t>
-      </w:r>
+      <w:proofErr w:type="gramEnd"/>
+      <w:proofErr w:type="gramStart"/>
       <w:proofErr w:type="spellStart"/>
-      <w:r>
-        <w:rPr>
-          <w:rFonts w:ascii="Trebuchet MS" w:hAnsi="Trebuchet MS"/>
-          <w:b/>
-          <w:bCs/>
-          <w:i/>
-          <w:color w:val="000000"/>
-          <w:sz w:val="20"/>
-          <w:szCs w:val="20"/>
-        </w:rPr>
-        <w:t>second</w:t>
-      </w:r>
-      <w:proofErr w:type="gramEnd"/>
-      <w:r>
-        <w:rPr>
-          <w:rFonts w:ascii="Trebuchet MS" w:hAnsi="Trebuchet MS"/>
-          <w:b/>
-          <w:bCs/>
-          <w:i/>
-          <w:color w:val="000000"/>
-          <w:sz w:val="20"/>
-          <w:szCs w:val="20"/>
-        </w:rPr>
-        <w:t>_tenant_passport_</w:t>
-      </w:r>
-      <w:proofErr w:type="gramStart"/>
-      <w:r>
-        <w:rPr>
-          <w:rFonts w:ascii="Trebuchet MS" w:hAnsi="Trebuchet MS"/>
-          <w:b/>
-          <w:bCs/>
-          <w:i/>
-          <w:color w:val="000000"/>
-          <w:sz w:val="20"/>
-          <w:szCs w:val="20"/>
-        </w:rPr>
-        <w:t>id</w:t>
-      </w:r>
+      <w:proofErr w:type="gramEnd"/>
+      <w:proofErr w:type="gramStart"/>
       <w:proofErr w:type="spellEnd"/>
-      <w:r>
-        <w:rPr>
-          <w:rFonts w:ascii="Trebuchet MS" w:hAnsi="Trebuchet MS"/>
-          <w:b/>
-          <w:bCs/>
-          <w:i/>
-          <w:color w:val="000000"/>
-          <w:sz w:val="20"/>
-          <w:szCs w:val="20"/>
-        </w:rPr>
-        <w:t xml:space="preserve"> }</w:t>
-      </w:r>
-      <w:proofErr w:type="gramEnd"/>
-      <w:r>
-        <w:rPr>
-          <w:rFonts w:ascii="Trebuchet MS" w:hAnsi="Trebuchet MS"/>
-          <w:b/>
-          <w:bCs/>
-          <w:i/>
-          <w:color w:val="000000"/>
-          <w:sz w:val="20"/>
-          <w:szCs w:val="20"/>
-        </w:rPr>
-        <w:t xml:space="preserve">} issued in </w:t>
-      </w:r>
-      <w:proofErr w:type="gramStart"/>
-      <w:r>
-        <w:rPr>
-          <w:rFonts w:ascii="Trebuchet MS" w:hAnsi="Trebuchet MS"/>
-          <w:b/>
-          <w:bCs/>
-          <w:i/>
-          <w:color w:val="000000"/>
-          <w:sz w:val="20"/>
-          <w:szCs w:val="20"/>
-        </w:rPr>
-        <w:t xml:space="preserve">{{ </w:t>
-      </w:r>
+      <w:proofErr w:type="gramEnd"/>
+      <w:proofErr w:type="gramStart"/>
       <w:proofErr w:type="spellStart"/>
-      <w:r>
-        <w:rPr>
-          <w:rFonts w:ascii="Trebuchet MS" w:hAnsi="Trebuchet MS"/>
-          <w:b/>
-          <w:bCs/>
-          <w:i/>
-          <w:color w:val="000000"/>
-          <w:sz w:val="20"/>
-          <w:szCs w:val="20"/>
-        </w:rPr>
-        <w:t>second</w:t>
-      </w:r>
-      <w:proofErr w:type="gramEnd"/>
-      <w:r>
-        <w:rPr>
-          <w:rFonts w:ascii="Trebuchet MS" w:hAnsi="Trebuchet MS"/>
-          <w:b/>
-          <w:bCs/>
-          <w:i/>
-          <w:color w:val="000000"/>
-          <w:sz w:val="20"/>
-          <w:szCs w:val="20"/>
-        </w:rPr>
-        <w:t>_tenant_passport_</w:t>
-      </w:r>
-      <w:proofErr w:type="gramStart"/>
-      <w:r>
-        <w:rPr>
-          <w:rFonts w:ascii="Trebuchet MS" w:hAnsi="Trebuchet MS"/>
-          <w:b/>
-          <w:bCs/>
-          <w:i/>
-          <w:color w:val="000000"/>
-          <w:sz w:val="20"/>
-          <w:szCs w:val="20"/>
-        </w:rPr>
-        <w:t>country</w:t>
-      </w:r>
+      <w:proofErr w:type="gramEnd"/>
+      <w:proofErr w:type="gramStart"/>
       <w:proofErr w:type="spellEnd"/>
-      <w:r>
-        <w:rPr>
-          <w:rFonts w:ascii="Trebuchet MS" w:hAnsi="Trebuchet MS"/>
-          <w:b/>
-          <w:bCs/>
-          <w:i/>
-          <w:color w:val="000000"/>
-          <w:sz w:val="20"/>
-          <w:szCs w:val="20"/>
-        </w:rPr>
-        <w:t xml:space="preserve"> }</w:t>
-      </w:r>
-      <w:proofErr w:type="gramEnd"/>
-      <w:r>
-        <w:rPr>
-          <w:rFonts w:ascii="Trebuchet MS" w:hAnsi="Trebuchet MS"/>
-          <w:b/>
-          <w:bCs/>
-          <w:i/>
-          <w:color w:val="000000"/>
-          <w:sz w:val="20"/>
-          <w:szCs w:val="20"/>
-        </w:rPr>
-        <w:t>})</w:t>
-      </w:r>
+      <w:proofErr w:type="gramEnd"/>
     </w:p>
     <w:p>
       <w:pPr>
@@ -2251,13 +2083,12 @@
           <w:szCs w:val="20"/>
           <w:lang w:val="en-US"/>
         </w:rPr>
-        <w:t xml:space="preserve">Address: </w:t>
-      </w:r>
-      <w:proofErr w:type="gramStart"/>
-      <w:r>
-        <w:rPr>
-          <w:rFonts w:ascii="Trebuchet MS" w:hAnsi="Trebuchet MS"/>
-          <w:b/>
+        <w:t>Address:</w:t>
+      </w:r>
+      <w:r>
+        <w:rPr>
+          <w:rFonts w:ascii="Trebuchet MS" w:hAnsi="Trebuchet MS"/>
+          <w:b w:val="0"/>
           <w:bCs/>
           <w:i/>
           <w:color w:val="000000"/>
@@ -2265,78 +2096,27 @@
           <w:szCs w:val="20"/>
           <w:lang w:val="en-US"/>
         </w:rPr>
-        <w:t xml:space="preserve">{{ </w:t>
-      </w:r>
+        <w:t xml:space="preserve"> </w:t>
+      </w:r>
+      <w:r>
+        <w:rPr>
+          <w:rFonts w:ascii="Trebuchet MS" w:hAnsi="Trebuchet MS"/>
+          <w:b w:val="0"/>
+          <w:bCs/>
+          <w:i w:val="0"/>
+          <w:color w:val="000000"/>
+          <w:sz w:val="20"/>
+          <w:szCs w:val="20"/>
+          <w:lang w:val="en-US"/>
+        </w:rPr>
+        <w:t>{{ second_tenant_address }}</w:t>
+      </w:r>
+      <w:proofErr w:type="gramStart"/>
       <w:proofErr w:type="spellStart"/>
-      <w:r>
-        <w:rPr>
-          <w:rFonts w:ascii="Trebuchet MS" w:hAnsi="Trebuchet MS"/>
-          <w:b/>
-          <w:bCs/>
-          <w:i/>
-          <w:color w:val="000000"/>
-          <w:sz w:val="20"/>
-          <w:szCs w:val="20"/>
-          <w:lang w:val="en-US"/>
-        </w:rPr>
-        <w:t>second</w:t>
-      </w:r>
-      <w:proofErr w:type="gramEnd"/>
-      <w:r>
-        <w:rPr>
-          <w:rFonts w:ascii="Trebuchet MS" w:hAnsi="Trebuchet MS"/>
-          <w:b/>
-          <w:bCs/>
-          <w:i/>
-          <w:color w:val="000000"/>
-          <w:sz w:val="20"/>
-          <w:szCs w:val="20"/>
-          <w:lang w:val="en-US"/>
-        </w:rPr>
-        <w:t>_tenant_</w:t>
-      </w:r>
-      <w:proofErr w:type="gramStart"/>
-      <w:r>
-        <w:rPr>
-          <w:rFonts w:ascii="Trebuchet MS" w:hAnsi="Trebuchet MS"/>
-          <w:b/>
-          <w:bCs/>
-          <w:i/>
-          <w:color w:val="000000"/>
-          <w:sz w:val="20"/>
-          <w:szCs w:val="20"/>
-          <w:lang w:val="en-US"/>
-        </w:rPr>
-        <w:t>address</w:t>
-      </w:r>
+      <w:proofErr w:type="gramEnd"/>
+      <w:proofErr w:type="gramStart"/>
       <w:proofErr w:type="spellEnd"/>
-      <w:r>
-        <w:rPr>
-          <w:rFonts w:ascii="Trebuchet MS" w:hAnsi="Trebuchet MS"/>
-          <w:b/>
-          <w:bCs/>
-          <w:i/>
-          <w:color w:val="000000"/>
-          <w:sz w:val="20"/>
-          <w:szCs w:val="20"/>
-          <w:lang w:val="en-US"/>
-        </w:rPr>
-        <w:t xml:space="preserve"> }</w:t>
-      </w:r>
-      <w:proofErr w:type="gramEnd"/>
-      <w:r>
-        <w:rPr>
-          <w:rFonts w:ascii="Trebuchet MS" w:hAnsi="Trebuchet MS"/>
-          <w:b/>
-          <w:bCs/>
-          <w:i/>
-          <w:color w:val="000000"/>
-          <w:sz w:val="20"/>
-          <w:szCs w:val="20"/>
-          <w:lang w:val="en-US"/>
-        </w:rPr>
-        <w:t>}</w:t>
-      </w:r>
+      <w:proofErr w:type="gramEnd"/>
     </w:p>
     <w:p>
       <w:pPr>
@@ -2365,86 +2145,38 @@
           <w:sz w:val="20"/>
           <w:szCs w:val="20"/>
         </w:rPr>
-        <w:t xml:space="preserve">Telephone: </w:t>
-      </w:r>
-      <w:proofErr w:type="gramStart"/>
-      <w:r>
-        <w:rPr>
-          <w:rFonts w:ascii="Trebuchet MS" w:hAnsi="Trebuchet MS"/>
-          <w:b/>
+        <w:t>Telephone:</w:t>
+      </w:r>
+      <w:r>
+        <w:rPr>
+          <w:rFonts w:ascii="Trebuchet MS" w:hAnsi="Trebuchet MS"/>
+          <w:b w:val="0"/>
           <w:bCs/>
           <w:i/>
           <w:color w:val="000000"/>
           <w:sz w:val="20"/>
           <w:szCs w:val="20"/>
         </w:rPr>
-        <w:t xml:space="preserve">{{ </w:t>
-      </w:r>
+        <w:t xml:space="preserve"> </w:t>
+      </w:r>
+      <w:r>
+        <w:rPr>
+          <w:rFonts w:ascii="Trebuchet MS" w:hAnsi="Trebuchet MS"/>
+          <w:b w:val="0"/>
+          <w:bCs/>
+          <w:i w:val="0"/>
+          <w:color w:val="000000"/>
+          <w:sz w:val="20"/>
+          <w:szCs w:val="20"/>
+        </w:rPr>
+        <w:t>{{ second_tenant_contact_number }}</w:t>
+      </w:r>
+      <w:proofErr w:type="gramStart"/>
       <w:proofErr w:type="spellStart"/>
-      <w:r>
-        <w:rPr>
-          <w:rFonts w:ascii="Trebuchet MS" w:hAnsi="Trebuchet MS"/>
-          <w:b/>
-          <w:bCs/>
-          <w:i/>
-          <w:color w:val="000000"/>
-          <w:sz w:val="20"/>
-          <w:szCs w:val="20"/>
-        </w:rPr>
-        <w:t>second</w:t>
-      </w:r>
-      <w:proofErr w:type="gramEnd"/>
-      <w:r>
-        <w:rPr>
-          <w:rFonts w:ascii="Trebuchet MS" w:hAnsi="Trebuchet MS"/>
-          <w:b/>
-          <w:bCs/>
-          <w:i/>
-          <w:color w:val="000000"/>
-          <w:sz w:val="20"/>
-          <w:szCs w:val="20"/>
-        </w:rPr>
-        <w:t>_tenant_contact_</w:t>
-      </w:r>
-      <w:proofErr w:type="gramStart"/>
-      <w:r>
-        <w:rPr>
-          <w:rFonts w:ascii="Trebuchet MS" w:hAnsi="Trebuchet MS"/>
-          <w:b/>
-          <w:bCs/>
-          <w:i/>
-          <w:color w:val="000000"/>
-          <w:sz w:val="20"/>
-          <w:szCs w:val="20"/>
-        </w:rPr>
-        <w:t>number</w:t>
-      </w:r>
+      <w:proofErr w:type="gramEnd"/>
+      <w:proofErr w:type="gramStart"/>
       <w:proofErr w:type="spellEnd"/>
-      <w:r>
-        <w:rPr>
-          <w:rFonts w:ascii="Trebuchet MS" w:hAnsi="Trebuchet MS"/>
-          <w:b/>
-          <w:bCs/>
-          <w:i/>
-          <w:color w:val="000000"/>
-          <w:sz w:val="20"/>
-          <w:szCs w:val="20"/>
-        </w:rPr>
-        <w:t xml:space="preserve"> }</w:t>
-      </w:r>
-      <w:proofErr w:type="gramEnd"/>
-      <w:r>
-        <w:rPr>
-          <w:rFonts w:ascii="Trebuchet MS" w:hAnsi="Trebuchet MS"/>
-          <w:b/>
-          <w:bCs/>
-          <w:i/>
-          <w:color w:val="000000"/>
-          <w:sz w:val="20"/>
-          <w:szCs w:val="20"/>
-        </w:rPr>
-        <w:t>}</w:t>
-      </w:r>
+      <w:proofErr w:type="gramEnd"/>
     </w:p>
     <w:p>
       <w:pPr>
@@ -2473,86 +2205,38 @@
           <w:sz w:val="20"/>
           <w:szCs w:val="20"/>
         </w:rPr>
-        <w:t xml:space="preserve">Email: </w:t>
-      </w:r>
-      <w:proofErr w:type="gramStart"/>
-      <w:r>
-        <w:rPr>
-          <w:rFonts w:ascii="Trebuchet MS" w:hAnsi="Trebuchet MS"/>
-          <w:b/>
+        <w:t>Email:</w:t>
+      </w:r>
+      <w:r>
+        <w:rPr>
+          <w:rFonts w:ascii="Trebuchet MS" w:hAnsi="Trebuchet MS"/>
+          <w:b w:val="0"/>
           <w:bCs/>
           <w:i/>
           <w:color w:val="000000"/>
           <w:sz w:val="20"/>
           <w:szCs w:val="20"/>
         </w:rPr>
-        <w:t xml:space="preserve">{{ </w:t>
-      </w:r>
+        <w:t xml:space="preserve"> </w:t>
+      </w:r>
+      <w:r>
+        <w:rPr>
+          <w:rFonts w:ascii="Trebuchet MS" w:hAnsi="Trebuchet MS"/>
+          <w:b w:val="0"/>
+          <w:bCs/>
+          <w:i w:val="0"/>
+          <w:color w:val="000000"/>
+          <w:sz w:val="20"/>
+          <w:szCs w:val="20"/>
+        </w:rPr>
+        <w:t>{{ second_tenant_email }}</w:t>
+      </w:r>
+      <w:proofErr w:type="gramStart"/>
       <w:proofErr w:type="spellStart"/>
-      <w:r>
-        <w:rPr>
-          <w:rFonts w:ascii="Trebuchet MS" w:hAnsi="Trebuchet MS"/>
-          <w:b/>
-          <w:bCs/>
-          <w:i/>
-          <w:color w:val="000000"/>
-          <w:sz w:val="20"/>
-          <w:szCs w:val="20"/>
-        </w:rPr>
-        <w:t>second</w:t>
-      </w:r>
-      <w:proofErr w:type="gramEnd"/>
-      <w:r>
-        <w:rPr>
-          <w:rFonts w:ascii="Trebuchet MS" w:hAnsi="Trebuchet MS"/>
-          <w:b/>
-          <w:bCs/>
-          <w:i/>
-          <w:color w:val="000000"/>
-          <w:sz w:val="20"/>
-          <w:szCs w:val="20"/>
-        </w:rPr>
-        <w:t>_tenant_</w:t>
-      </w:r>
-      <w:proofErr w:type="gramStart"/>
-      <w:r>
-        <w:rPr>
-          <w:rFonts w:ascii="Trebuchet MS" w:hAnsi="Trebuchet MS"/>
-          <w:b/>
-          <w:bCs/>
-          <w:i/>
-          <w:color w:val="000000"/>
-          <w:sz w:val="20"/>
-          <w:szCs w:val="20"/>
-        </w:rPr>
-        <w:t>email</w:t>
-      </w:r>
+      <w:proofErr w:type="gramEnd"/>
+      <w:proofErr w:type="gramStart"/>
       <w:proofErr w:type="spellEnd"/>
-      <w:r>
-        <w:rPr>
-          <w:rFonts w:ascii="Trebuchet MS" w:hAnsi="Trebuchet MS"/>
-          <w:b/>
-          <w:bCs/>
-          <w:i/>
-          <w:color w:val="000000"/>
-          <w:sz w:val="20"/>
-          <w:szCs w:val="20"/>
-        </w:rPr>
-        <w:t xml:space="preserve"> }</w:t>
-      </w:r>
-      <w:proofErr w:type="gramEnd"/>
-      <w:r>
-        <w:rPr>
-          <w:rFonts w:ascii="Trebuchet MS" w:hAnsi="Trebuchet MS"/>
-          <w:b/>
-          <w:bCs/>
-          <w:i/>
-          <w:color w:val="000000"/>
-          <w:sz w:val="20"/>
-          <w:szCs w:val="20"/>
-        </w:rPr>
-        <w:t>}</w:t>
-      </w:r>
+      <w:proofErr w:type="gramEnd"/>
     </w:p>
     <w:p>
       <w:pPr>

</xml_diff>